<commit_message>
docs: resultats et captures du pipeline GitLab dans le rapport final
</commit_message>
<xml_diff>
--- a/docs/Rapport_final.docx
+++ b/docs/Rapport_final.docx
@@ -429,7 +429,7 @@
         </w:rPr>
         <w:t>9. Conclusion</w:t>
         <w:tab/>
-        <w:t>9</w:t>
+        <w:t>10</w:t>
       </w:r>
       <w:r>
         <w:fldChar w:fldCharType="end"/>
@@ -6281,7 +6281,7 @@
       <w:r>
         <w:drawing>
           <wp:inline xmlns:a="http://schemas.openxmlformats.org/drawingml/2006/main" xmlns:pic="http://schemas.openxmlformats.org/drawingml/2006/picture">
-            <wp:extent cx="5580000" cy="1520348"/>
+            <wp:extent cx="5940000" cy="1404518"/>
             <wp:docPr id="6" name="Picture 6"/>
             <wp:cNvGraphicFramePr>
               <a:graphicFrameLocks noChangeAspect="1"/>
@@ -6290,7 +6290,7 @@
               <a:graphicData uri="http://schemas.openxmlformats.org/drawingml/2006/picture">
                 <pic:pic>
                   <pic:nvPicPr>
-                    <pic:cNvPr id="0" name="pipeline.png"/>
+                    <pic:cNvPr id="0" name="ci-pipeline.png"/>
                     <pic:cNvPicPr/>
                   </pic:nvPicPr>
                   <pic:blipFill>
@@ -6302,7 +6302,7 @@
                   <pic:spPr>
                     <a:xfrm>
                       <a:off x="0" y="0"/>
-                      <a:ext cx="5580000" cy="1520348"/>
+                      <a:ext cx="5940000" cy="1404518"/>
                     </a:xfrm>
                     <a:prstGeom prst="rect"/>
                   </pic:spPr>
@@ -6323,7 +6323,7 @@
           <w:color w:val="555B66"/>
           <w:sz w:val="17"/>
         </w:rPr>
-        <w:t>Figure 6 - Étapes du pipeline GitLab CI</w:t>
+        <w:t>Figure 6 - Pipeline GitLab réussi : graphe réel des stages (capture du pipeline #2924651734)</w:t>
       </w:r>
     </w:p>
     <w:p>
@@ -6526,89 +6526,474 @@
         <w:t>.</w:t>
       </w:r>
     </w:p>
+    <w:p>
+      <w:pPr>
+        <w:jc w:val="left"/>
+      </w:pPr>
+      <w:r>
+        <w:t xml:space="preserve">Le pipeline a été exécuté sur GitLab.com (runners partagés) : pipeline </w:t>
+      </w:r>
+      <w:r>
+        <w:rPr>
+          <w:b/>
+        </w:rPr>
+        <w:t>#2924651734</w:t>
+      </w:r>
+      <w:r>
+        <w:t xml:space="preserve">, commit </w:t>
+      </w:r>
+      <w:r>
+        <w:rPr>
+          <w:rFonts w:ascii="Consolas" w:hAnsi="Consolas"/>
+          <w:sz w:val="19"/>
+        </w:rPr>
+        <w:t>429d335</w:t>
+      </w:r>
+      <w:r>
+        <w:t xml:space="preserve">, statut </w:t>
+      </w:r>
+      <w:r>
+        <w:rPr>
+          <w:b/>
+        </w:rPr>
+        <w:t>réussi</w:t>
+      </w:r>
+      <w:r>
+        <w:t xml:space="preserve"> en 4,8 min (https://gitlab.com/essalhi-moussa-group/automatisation_des_tests_et_qualite_logicielle/-/pipelines/2924651734). Rapport Allure publié sur GitLab Pages : https://automatisation-des-tests-et-qualite-logicielle-5d7828.gitlab.io/.</w:t>
+      </w:r>
+    </w:p>
+    <w:p>
+      <w:pPr>
+        <w:keepNext/>
+      </w:pPr>
+      <w:r>
+        <w:rPr>
+          <w:b/>
+          <w:sz w:val="18"/>
+        </w:rPr>
+        <w:t>Tableau 6 - Résultats réels du pipeline GitLab (reports/ci/pipeline-gitlab.json)</w:t>
+      </w:r>
+    </w:p>
     <w:tbl>
       <w:tblPr>
         <w:tblStyle w:val="TableGrid"/>
         <w:tblW w:type="auto" w:w="0"/>
+        <w:jc w:val="center"/>
+        <w:tblLayout w:type="fixed"/>
         <w:tblLook w:firstColumn="1" w:firstRow="1" w:lastColumn="0" w:lastRow="0" w:noHBand="0" w:noVBand="1" w:val="04A0"/>
       </w:tblPr>
       <w:tblGrid>
-        <w:gridCol w:w="9638"/>
+        <w:gridCol w:w="3213"/>
+        <w:gridCol w:w="3213"/>
+        <w:gridCol w:w="3213"/>
       </w:tblGrid>
       <w:tr>
+        <w:trPr>
+          <w:tblHeader w:val="true"/>
+        </w:trPr>
         <w:tc>
           <w:tcPr>
-            <w:tcW w:type="dxa" w:w="9638"/>
-            <w:shd w:val="clear" w:color="auto" w:fill="FFF7E6"/>
+            <w:tcW w:type="dxa" w:w="2142"/>
+            <w:shd w:val="clear" w:color="auto" w:fill="1F4E79"/>
           </w:tcPr>
           <w:p>
             <w:pPr>
-              <w:spacing w:after="40"/>
+              <w:spacing w:after="20"/>
             </w:pPr>
             <w:r>
               <w:rPr>
                 <w:b/>
-                <w:sz w:val="19"/>
+                <w:color w:val="FFFFFF"/>
+                <w:sz w:val="16"/>
               </w:rPr>
-              <w:t>Statut de vérification.</w:t>
+              <w:t>Job</w:t>
             </w:r>
+          </w:p>
+        </w:tc>
+        <w:tc>
+          <w:tcPr>
+            <w:tcW w:type="dxa" w:w="3480"/>
+            <w:shd w:val="clear" w:color="auto" w:fill="1F4E79"/>
+          </w:tcPr>
+          <w:p>
+            <w:pPr>
+              <w:spacing w:after="20"/>
+            </w:pPr>
             <w:r>
               <w:rPr>
-                <w:sz w:val="19"/>
+                <w:b/>
+                <w:color w:val="FFFFFF"/>
+                <w:sz w:val="16"/>
               </w:rPr>
-              <w:t xml:space="preserve"> Les fichiers </w:t>
+              <w:t>Résultat</w:t>
             </w:r>
+          </w:p>
+        </w:tc>
+        <w:tc>
+          <w:tcPr>
+            <w:tcW w:type="dxa" w:w="4016"/>
+            <w:shd w:val="clear" w:color="auto" w:fill="1F4E79"/>
+          </w:tcPr>
+          <w:p>
+            <w:pPr>
+              <w:spacing w:after="20"/>
+            </w:pPr>
             <w:r>
               <w:rPr>
-                <w:rFonts w:ascii="Consolas" w:hAnsi="Consolas"/>
-                <w:sz w:val="17"/>
+                <w:b/>
+                <w:color w:val="FFFFFF"/>
+                <w:sz w:val="16"/>
               </w:rPr>
-              <w:t>.gitlab-ci.yml</w:t>
+              <w:t>Cible / remarque</w:t>
             </w:r>
+          </w:p>
+        </w:tc>
+      </w:tr>
+      <w:tr>
+        <w:trPr>
+          <w:cantSplit/>
+        </w:trPr>
+        <w:tc>
+          <w:tcPr>
+            <w:tcW w:type="dxa" w:w="2142"/>
+          </w:tcPr>
+          <w:p>
+            <w:pPr>
+              <w:spacing w:after="20" w:line="240" w:lineRule="auto"/>
+            </w:pPr>
             <w:r>
               <w:rPr>
-                <w:sz w:val="19"/>
+                <w:sz w:val="16"/>
               </w:rPr>
-              <w:t xml:space="preserve"> et </w:t>
+              <w:t>api-restassured</w:t>
             </w:r>
+          </w:p>
+        </w:tc>
+        <w:tc>
+          <w:tcPr>
+            <w:tcW w:type="dxa" w:w="3480"/>
+          </w:tcPr>
+          <w:p>
+            <w:pPr>
+              <w:spacing w:after="20" w:line="240" w:lineRule="auto"/>
+            </w:pPr>
             <w:r>
               <w:rPr>
-                <w:rFonts w:ascii="Consolas" w:hAnsi="Consolas"/>
-                <w:sz w:val="17"/>
+                <w:sz w:val="16"/>
               </w:rPr>
-              <w:t>Jenkinsfile</w:t>
+              <w:t>9 / 9 tests réussis</w:t>
             </w:r>
+          </w:p>
+        </w:tc>
+        <w:tc>
+          <w:tcPr>
+            <w:tcW w:type="dxa" w:w="4016"/>
+          </w:tcPr>
+          <w:p>
+            <w:pPr>
+              <w:spacing w:after="20" w:line="240" w:lineRule="auto"/>
+            </w:pPr>
             <w:r>
               <w:rPr>
-                <w:sz w:val="19"/>
+                <w:sz w:val="16"/>
               </w:rPr>
-              <w:t xml:space="preserve"> ont été validés syntaxiquement et chacune de leurs commandes a été exécutée localement (Maven, Newman, JMeter, ZAP, génération Allure). Les captures du pipeline sont à déposer dans </w:t>
+              <w:t>https://reqres.in</w:t>
             </w:r>
+          </w:p>
+          <w:p>
+            <w:pPr>
+              <w:spacing w:after="20" w:line="240" w:lineRule="auto"/>
+            </w:pPr>
             <w:r>
               <w:rPr>
-                <w:rFonts w:ascii="Consolas" w:hAnsi="Consolas"/>
-                <w:sz w:val="17"/>
+                <w:sz w:val="16"/>
               </w:rPr>
-              <w:t>docs/img/ci/</w:t>
+              <w:t>(controle HTTP 200, quota restant 39)</w:t>
             </w:r>
+          </w:p>
+        </w:tc>
+      </w:tr>
+      <w:tr>
+        <w:trPr>
+          <w:cantSplit/>
+        </w:trPr>
+        <w:tc>
+          <w:tcPr>
+            <w:tcW w:type="dxa" w:w="2142"/>
+            <w:shd w:val="clear" w:color="auto" w:fill="F2F5F9"/>
+          </w:tcPr>
+          <w:p>
+            <w:pPr>
+              <w:spacing w:after="20" w:line="240" w:lineRule="auto"/>
+            </w:pPr>
             <w:r>
               <w:rPr>
-                <w:sz w:val="19"/>
+                <w:sz w:val="16"/>
               </w:rPr>
-              <w:t xml:space="preserve"> (noms ci-dessous) puis le rapport est régénéré avec </w:t>
+              <w:t>api-newman</w:t>
             </w:r>
+          </w:p>
+        </w:tc>
+        <w:tc>
+          <w:tcPr>
+            <w:tcW w:type="dxa" w:w="3480"/>
+            <w:shd w:val="clear" w:color="auto" w:fill="F2F5F9"/>
+          </w:tcPr>
+          <w:p>
+            <w:pPr>
+              <w:spacing w:after="20" w:line="240" w:lineRule="auto"/>
+            </w:pPr>
             <w:r>
               <w:rPr>
-                <w:rFonts w:ascii="Consolas" w:hAnsi="Consolas"/>
-                <w:sz w:val="17"/>
+                <w:sz w:val="16"/>
               </w:rPr>
-              <w:t>python scripts/build_docs.py rapport</w:t>
+              <w:t>37 / 37 assertions</w:t>
             </w:r>
+          </w:p>
+        </w:tc>
+        <w:tc>
+          <w:tcPr>
+            <w:tcW w:type="dxa" w:w="4016"/>
+            <w:shd w:val="clear" w:color="auto" w:fill="F2F5F9"/>
+          </w:tcPr>
+          <w:p>
+            <w:pPr>
+              <w:spacing w:after="20" w:line="240" w:lineRule="auto"/>
+            </w:pPr>
             <w:r>
               <w:rPr>
-                <w:sz w:val="19"/>
+                <w:sz w:val="16"/>
               </w:rPr>
-              <w:t>.</w:t>
+              <w:t>https://reqres.in</w:t>
+            </w:r>
+          </w:p>
+          <w:p>
+            <w:pPr>
+              <w:spacing w:after="20" w:line="240" w:lineRule="auto"/>
+            </w:pPr>
+            <w:r>
+              <w:rPr>
+                <w:sz w:val="16"/>
+              </w:rPr>
+              <w:t>(controle HTTP 200, quota restant 39)</w:t>
+            </w:r>
+          </w:p>
+        </w:tc>
+      </w:tr>
+      <w:tr>
+        <w:trPr>
+          <w:cantSplit/>
+        </w:trPr>
+        <w:tc>
+          <w:tcPr>
+            <w:tcW w:type="dxa" w:w="2142"/>
+          </w:tcPr>
+          <w:p>
+            <w:pPr>
+              <w:spacing w:after="20" w:line="240" w:lineRule="auto"/>
+            </w:pPr>
+            <w:r>
+              <w:rPr>
+                <w:sz w:val="16"/>
+              </w:rPr>
+              <w:t>ui-selenium</w:t>
+            </w:r>
+          </w:p>
+        </w:tc>
+        <w:tc>
+          <w:tcPr>
+            <w:tcW w:type="dxa" w:w="3480"/>
+          </w:tcPr>
+          <w:p>
+            <w:pPr>
+              <w:spacing w:after="20" w:line="240" w:lineRule="auto"/>
+            </w:pPr>
+            <w:r>
+              <w:rPr>
+                <w:sz w:val="16"/>
+              </w:rPr>
+              <w:t>21 / 21 tests réussis</w:t>
+            </w:r>
+          </w:p>
+        </w:tc>
+        <w:tc>
+          <w:tcPr>
+            <w:tcW w:type="dxa" w:w="4016"/>
+          </w:tcPr>
+          <w:p>
+            <w:pPr>
+              <w:spacing w:after="20" w:line="240" w:lineRule="auto"/>
+            </w:pPr>
+            <w:r>
+              <w:rPr>
+                <w:sz w:val="16"/>
+              </w:rPr>
+              <w:t>service selenium/standalone-chrome</w:t>
+            </w:r>
+          </w:p>
+        </w:tc>
+      </w:tr>
+      <w:tr>
+        <w:trPr>
+          <w:cantSplit/>
+        </w:trPr>
+        <w:tc>
+          <w:tcPr>
+            <w:tcW w:type="dxa" w:w="2142"/>
+            <w:shd w:val="clear" w:color="auto" w:fill="F2F5F9"/>
+          </w:tcPr>
+          <w:p>
+            <w:pPr>
+              <w:spacing w:after="20" w:line="240" w:lineRule="auto"/>
+            </w:pPr>
+            <w:r>
+              <w:rPr>
+                <w:sz w:val="16"/>
+              </w:rPr>
+              <w:t>security-zap</w:t>
+            </w:r>
+          </w:p>
+        </w:tc>
+        <w:tc>
+          <w:tcPr>
+            <w:tcW w:type="dxa" w:w="3480"/>
+            <w:shd w:val="clear" w:color="auto" w:fill="F2F5F9"/>
+          </w:tcPr>
+          <w:p>
+            <w:pPr>
+              <w:spacing w:after="20" w:line="240" w:lineRule="auto"/>
+            </w:pPr>
+            <w:r>
+              <w:rPr>
+                <w:sz w:val="16"/>
+              </w:rPr>
+              <w:t>0 échec, 17 avertissements, 50 contrôles réussis</w:t>
+            </w:r>
+          </w:p>
+        </w:tc>
+        <w:tc>
+          <w:tcPr>
+            <w:tcW w:type="dxa" w:w="4016"/>
+            <w:shd w:val="clear" w:color="auto" w:fill="F2F5F9"/>
+          </w:tcPr>
+          <w:p>
+            <w:pPr>
+              <w:spacing w:after="20" w:line="240" w:lineRule="auto"/>
+            </w:pPr>
+            <w:r>
+              <w:rPr>
+                <w:sz w:val="16"/>
+              </w:rPr>
+              <w:t>zap-baseline.py (image officielle)</w:t>
+            </w:r>
+          </w:p>
+        </w:tc>
+      </w:tr>
+      <w:tr>
+        <w:trPr>
+          <w:cantSplit/>
+        </w:trPr>
+        <w:tc>
+          <w:tcPr>
+            <w:tcW w:type="dxa" w:w="2142"/>
+          </w:tcPr>
+          <w:p>
+            <w:pPr>
+              <w:spacing w:after="20" w:line="240" w:lineRule="auto"/>
+            </w:pPr>
+            <w:r>
+              <w:rPr>
+                <w:sz w:val="16"/>
+              </w:rPr>
+              <w:t>allure-report, pages</w:t>
+            </w:r>
+          </w:p>
+        </w:tc>
+        <w:tc>
+          <w:tcPr>
+            <w:tcW w:type="dxa" w:w="3480"/>
+          </w:tcPr>
+          <w:p>
+            <w:pPr>
+              <w:spacing w:after="20" w:line="240" w:lineRule="auto"/>
+            </w:pPr>
+            <w:r>
+              <w:rPr>
+                <w:sz w:val="16"/>
+              </w:rPr>
+              <w:t>rapport généré et publié</w:t>
+            </w:r>
+          </w:p>
+        </w:tc>
+        <w:tc>
+          <w:tcPr>
+            <w:tcW w:type="dxa" w:w="4016"/>
+          </w:tcPr>
+          <w:p>
+            <w:pPr>
+              <w:spacing w:after="20" w:line="240" w:lineRule="auto"/>
+            </w:pPr>
+            <w:r>
+              <w:rPr>
+                <w:sz w:val="16"/>
+              </w:rPr>
+              <w:t>GitLab Pages</w:t>
+            </w:r>
+          </w:p>
+        </w:tc>
+      </w:tr>
+      <w:tr>
+        <w:trPr>
+          <w:cantSplit/>
+        </w:trPr>
+        <w:tc>
+          <w:tcPr>
+            <w:tcW w:type="dxa" w:w="2142"/>
+            <w:shd w:val="clear" w:color="auto" w:fill="F2F5F9"/>
+          </w:tcPr>
+          <w:p>
+            <w:pPr>
+              <w:spacing w:after="20" w:line="240" w:lineRule="auto"/>
+            </w:pPr>
+            <w:r>
+              <w:rPr>
+                <w:sz w:val="16"/>
+              </w:rPr>
+              <w:t>perf-jmeter</w:t>
+            </w:r>
+          </w:p>
+        </w:tc>
+        <w:tc>
+          <w:tcPr>
+            <w:tcW w:type="dxa" w:w="3480"/>
+            <w:shd w:val="clear" w:color="auto" w:fill="F2F5F9"/>
+          </w:tcPr>
+          <w:p>
+            <w:pPr>
+              <w:spacing w:after="20" w:line="240" w:lineRule="auto"/>
+            </w:pPr>
+            <w:r>
+              <w:rPr>
+                <w:sz w:val="16"/>
+              </w:rPr>
+              <w:t>manuel (non déclenché)</w:t>
+            </w:r>
+          </w:p>
+        </w:tc>
+        <w:tc>
+          <w:tcPr>
+            <w:tcW w:type="dxa" w:w="4016"/>
+            <w:shd w:val="clear" w:color="auto" w:fill="F2F5F9"/>
+          </w:tcPr>
+          <w:p>
+            <w:pPr>
+              <w:spacing w:after="20" w:line="240" w:lineRule="auto"/>
+            </w:pPr>
+            <w:r>
+              <w:rPr>
+                <w:sz w:val="16"/>
+              </w:rPr>
+              <w:t>évite d'épuiser le quota Reqres à chaque commit</w:t>
             </w:r>
           </w:p>
         </w:tc>
@@ -6622,227 +7007,55 @@
     <w:p>
       <w:pPr>
         <w:keepNext/>
+        <w:jc w:val="center"/>
+      </w:pPr>
+      <w:r>
+        <w:drawing>
+          <wp:inline xmlns:a="http://schemas.openxmlformats.org/drawingml/2006/main" xmlns:pic="http://schemas.openxmlformats.org/drawingml/2006/picture">
+            <wp:extent cx="5580000" cy="1639372"/>
+            <wp:docPr id="7" name="Picture 7"/>
+            <wp:cNvGraphicFramePr>
+              <a:graphicFrameLocks noChangeAspect="1"/>
+            </wp:cNvGraphicFramePr>
+            <a:graphic>
+              <a:graphicData uri="http://schemas.openxmlformats.org/drawingml/2006/picture">
+                <pic:pic>
+                  <pic:nvPicPr>
+                    <pic:cNvPr id="0" name="ci-captures.png"/>
+                    <pic:cNvPicPr/>
+                  </pic:nvPicPr>
+                  <pic:blipFill>
+                    <a:blip r:embed="rId16"/>
+                    <a:stretch>
+                      <a:fillRect/>
+                    </a:stretch>
+                  </pic:blipFill>
+                  <pic:spPr>
+                    <a:xfrm>
+                      <a:off x="0" y="0"/>
+                      <a:ext cx="5580000" cy="1639372"/>
+                    </a:xfrm>
+                    <a:prstGeom prst="rect"/>
+                  </pic:spPr>
+                </pic:pic>
+              </a:graphicData>
+            </a:graphic>
+          </wp:inline>
+        </w:drawing>
+      </w:r>
+    </w:p>
+    <w:p>
+      <w:pPr>
+        <w:jc w:val="center"/>
       </w:pPr>
       <w:r>
         <w:rPr>
-          <w:b/>
-          <w:sz w:val="18"/>
+          <w:i/>
+          <w:color w:val="555B66"/>
+          <w:sz w:val="17"/>
         </w:rPr>
-        <w:t>Tableau 6 - Captures du pipeline à ajouter</w:t>
+        <w:t>Figure 7 - Pipeline réel : onglet Tests (rapport JUnit) ; rapport Allure publié (GitLab Pages ou Jenkins)</w:t>
       </w:r>
-    </w:p>
-    <w:tbl>
-      <w:tblPr>
-        <w:tblStyle w:val="TableGrid"/>
-        <w:tblW w:type="auto" w:w="0"/>
-        <w:jc w:val="center"/>
-        <w:tblLayout w:type="fixed"/>
-        <w:tblLook w:firstColumn="1" w:firstRow="1" w:lastColumn="0" w:lastRow="0" w:noHBand="0" w:noVBand="1" w:val="04A0"/>
-      </w:tblPr>
-      <w:tblGrid>
-        <w:gridCol w:w="4819"/>
-        <w:gridCol w:w="4819"/>
-      </w:tblGrid>
-      <w:tr>
-        <w:trPr>
-          <w:tblHeader w:val="true"/>
-        </w:trPr>
-        <w:tc>
-          <w:tcPr>
-            <w:tcW w:type="dxa" w:w="3855"/>
-            <w:shd w:val="clear" w:color="auto" w:fill="1F4E79"/>
-          </w:tcPr>
-          <w:p>
-            <w:pPr>
-              <w:spacing w:after="20"/>
-            </w:pPr>
-            <w:r>
-              <w:rPr>
-                <w:b/>
-                <w:color w:val="FFFFFF"/>
-                <w:sz w:val="17"/>
-              </w:rPr>
-              <w:t>Fichier à déposer dans docs/img/ci/</w:t>
-            </w:r>
-          </w:p>
-        </w:tc>
-        <w:tc>
-          <w:tcPr>
-            <w:tcW w:type="dxa" w:w="5783"/>
-            <w:shd w:val="clear" w:color="auto" w:fill="1F4E79"/>
-          </w:tcPr>
-          <w:p>
-            <w:pPr>
-              <w:spacing w:after="20"/>
-            </w:pPr>
-            <w:r>
-              <w:rPr>
-                <w:b/>
-                <w:color w:val="FFFFFF"/>
-                <w:sz w:val="17"/>
-              </w:rPr>
-              <w:t>Contenu</w:t>
-            </w:r>
-          </w:p>
-        </w:tc>
-      </w:tr>
-      <w:tr>
-        <w:trPr>
-          <w:cantSplit/>
-        </w:trPr>
-        <w:tc>
-          <w:tcPr>
-            <w:tcW w:type="dxa" w:w="3855"/>
-          </w:tcPr>
-          <w:p>
-            <w:pPr>
-              <w:spacing w:after="20" w:line="240" w:lineRule="auto"/>
-            </w:pPr>
-            <w:r>
-              <w:rPr>
-                <w:sz w:val="17"/>
-              </w:rPr>
-              <w:t>1-pipeline.png</w:t>
-            </w:r>
-          </w:p>
-        </w:tc>
-        <w:tc>
-          <w:tcPr>
-            <w:tcW w:type="dxa" w:w="5783"/>
-          </w:tcPr>
-          <w:p>
-            <w:pPr>
-              <w:spacing w:after="20" w:line="240" w:lineRule="auto"/>
-            </w:pPr>
-            <w:r>
-              <w:rPr>
-                <w:sz w:val="17"/>
-              </w:rPr>
-              <w:t>pipeline réussi (graphe des stages)</w:t>
-            </w:r>
-          </w:p>
-        </w:tc>
-      </w:tr>
-      <w:tr>
-        <w:trPr>
-          <w:cantSplit/>
-        </w:trPr>
-        <w:tc>
-          <w:tcPr>
-            <w:tcW w:type="dxa" w:w="3855"/>
-            <w:shd w:val="clear" w:color="auto" w:fill="F2F5F9"/>
-          </w:tcPr>
-          <w:p>
-            <w:pPr>
-              <w:spacing w:after="20" w:line="240" w:lineRule="auto"/>
-            </w:pPr>
-            <w:r>
-              <w:rPr>
-                <w:sz w:val="17"/>
-              </w:rPr>
-              <w:t>2-tests-junit.png</w:t>
-            </w:r>
-          </w:p>
-        </w:tc>
-        <w:tc>
-          <w:tcPr>
-            <w:tcW w:type="dxa" w:w="5783"/>
-            <w:shd w:val="clear" w:color="auto" w:fill="F2F5F9"/>
-          </w:tcPr>
-          <w:p>
-            <w:pPr>
-              <w:spacing w:after="20" w:line="240" w:lineRule="auto"/>
-            </w:pPr>
-            <w:r>
-              <w:rPr>
-                <w:sz w:val="17"/>
-              </w:rPr>
-              <w:t>onglet Tests (rapport JUnit)</w:t>
-            </w:r>
-          </w:p>
-        </w:tc>
-      </w:tr>
-      <w:tr>
-        <w:trPr>
-          <w:cantSplit/>
-        </w:trPr>
-        <w:tc>
-          <w:tcPr>
-            <w:tcW w:type="dxa" w:w="3855"/>
-          </w:tcPr>
-          <w:p>
-            <w:pPr>
-              <w:spacing w:after="20" w:line="240" w:lineRule="auto"/>
-            </w:pPr>
-            <w:r>
-              <w:rPr>
-                <w:sz w:val="17"/>
-              </w:rPr>
-              <w:t>3-allure.png</w:t>
-            </w:r>
-          </w:p>
-        </w:tc>
-        <w:tc>
-          <w:tcPr>
-            <w:tcW w:type="dxa" w:w="5783"/>
-          </w:tcPr>
-          <w:p>
-            <w:pPr>
-              <w:spacing w:after="20" w:line="240" w:lineRule="auto"/>
-            </w:pPr>
-            <w:r>
-              <w:rPr>
-                <w:sz w:val="17"/>
-              </w:rPr>
-              <w:t>rapport Allure publié (GitLab Pages ou Jenkins)</w:t>
-            </w:r>
-          </w:p>
-        </w:tc>
-      </w:tr>
-      <w:tr>
-        <w:trPr>
-          <w:cantSplit/>
-        </w:trPr>
-        <w:tc>
-          <w:tcPr>
-            <w:tcW w:type="dxa" w:w="3855"/>
-            <w:shd w:val="clear" w:color="auto" w:fill="F2F5F9"/>
-          </w:tcPr>
-          <w:p>
-            <w:pPr>
-              <w:spacing w:after="20" w:line="240" w:lineRule="auto"/>
-            </w:pPr>
-            <w:r>
-              <w:rPr>
-                <w:sz w:val="17"/>
-              </w:rPr>
-              <w:t>4-notification.png</w:t>
-            </w:r>
-          </w:p>
-        </w:tc>
-        <w:tc>
-          <w:tcPr>
-            <w:tcW w:type="dxa" w:w="5783"/>
-            <w:shd w:val="clear" w:color="auto" w:fill="F2F5F9"/>
-          </w:tcPr>
-          <w:p>
-            <w:pPr>
-              <w:spacing w:after="20" w:line="240" w:lineRule="auto"/>
-            </w:pPr>
-            <w:r>
-              <w:rPr>
-                <w:sz w:val="17"/>
-              </w:rPr>
-              <w:t>notification de fin de pipeline (e-mail ou Slack/Discord)</w:t>
-            </w:r>
-          </w:p>
-        </w:tc>
-      </w:tr>
-    </w:tbl>
-    <w:p>
-      <w:pPr>
-        <w:spacing w:after="40"/>
-      </w:pPr>
     </w:p>
     <w:p>
       <w:pPr>
@@ -7223,6 +7436,45 @@
           </w:p>
         </w:tc>
       </w:tr>
+      <w:tr>
+        <w:trPr>
+          <w:cantSplit/>
+        </w:trPr>
+        <w:tc>
+          <w:tcPr>
+            <w:tcW w:type="dxa" w:w="4252"/>
+            <w:shd w:val="clear" w:color="auto" w:fill="F2F5F9"/>
+          </w:tcPr>
+          <w:p>
+            <w:pPr>
+              <w:spacing w:after="20" w:line="240" w:lineRule="auto"/>
+            </w:pPr>
+            <w:r>
+              <w:rPr>
+                <w:sz w:val="17"/>
+              </w:rPr>
+              <w:t>Premiers pipelines GitLab en échec : YAML invalide (« : » lu comme une clé), compte non vérifié</w:t>
+            </w:r>
+          </w:p>
+        </w:tc>
+        <w:tc>
+          <w:tcPr>
+            <w:tcW w:type="dxa" w:w="5386"/>
+            <w:shd w:val="clear" w:color="auto" w:fill="F2F5F9"/>
+          </w:tcPr>
+          <w:p>
+            <w:pPr>
+              <w:spacing w:after="20" w:line="240" w:lineRule="auto"/>
+            </w:pPr>
+            <w:r>
+              <w:rPr>
+                <w:sz w:val="17"/>
+              </w:rPr>
+              <w:t>Script en bloc multi-ligne et contrôle du type de chaque ligne ; vérification d'identité GitLab, puis pipeline réussi</w:t>
+            </w:r>
+          </w:p>
+        </w:tc>
+      </w:tr>
     </w:tbl>
     <w:p>
       <w:pPr>
@@ -7335,7 +7587,7 @@
         <w:jc w:val="both"/>
       </w:pPr>
       <w:r>
-        <w:t>Le projet livre une chaîne de tests automatisés complète et reproductible : 21 tests UI Selenium réussis sur 21, 9 tests API RestAssured réussis sur 9, 37 assertions Postman validées sur 37, un plan de charge JMeter de 50 utilisateurs et un scan ZAP assorti de recommandations chiffrées. Le principal enseignement est que la qualité des résultats dépend autant de la cible que des scripts : les limites de Reqres (429) et l'instabilité de certains sites de démonstration imposent de séparer les tests déterministes (mock, page locale) des tests sur services tiers, et de rapporter honnêtement les écarts plutôt que de les masquer. Il reste à exécuter le pipeline sur la plateforme CI, à y joindre les captures prévues et à enrichir le plan selon les recommandations du chapitre 8.</w:t>
+        <w:t>Le projet livre une chaîne de tests automatisés complète et reproductible : 21 tests UI Selenium réussis sur 21, 9 tests API RestAssured réussis sur 9, 37 assertions Postman validées sur 37, un plan de charge JMeter de 50 utilisateurs et un scan ZAP assorti de recommandations chiffrées. Le principal enseignement est que la qualité des résultats dépend autant de la cible que des scripts : les limites de Reqres (429) et l'instabilité de certains sites de démonstration imposent de séparer les tests déterministes (mock, page locale) des tests sur services tiers, et de rapporter honnêtement les écarts plutôt que de les masquer. La suite logique est d'enrichir le dispositif selon les recommandations du chapitre 8.</w:t>
       </w:r>
     </w:p>
     <w:sectPr>

</xml_diff>

<commit_message>
docs: capture de la notification e-mail et preuves du pipeline #2924665070
</commit_message>
<xml_diff>
--- a/docs/Rapport_final.docx
+++ b/docs/Rapport_final.docx
@@ -429,7 +429,7 @@
         </w:rPr>
         <w:t>9. Conclusion</w:t>
         <w:tab/>
-        <w:t>10</w:t>
+        <w:t>9</w:t>
       </w:r>
       <w:r>
         <w:fldChar w:fldCharType="end"/>
@@ -6323,7 +6323,7 @@
           <w:color w:val="555B66"/>
           <w:sz w:val="17"/>
         </w:rPr>
-        <w:t>Figure 6 - Pipeline GitLab réussi : graphe réel des stages (capture du pipeline #2924651734)</w:t>
+        <w:t>Figure 6 - Pipeline GitLab réussi : graphe réel des stages (capture du pipeline #2924665070)</w:t>
       </w:r>
     </w:p>
     <w:p>
@@ -6537,7 +6537,7 @@
         <w:rPr>
           <w:b/>
         </w:rPr>
-        <w:t>#2924651734</w:t>
+        <w:t>#2924665070</w:t>
       </w:r>
       <w:r>
         <w:t xml:space="preserve">, commit </w:t>
@@ -6547,7 +6547,7 @@
           <w:rFonts w:ascii="Consolas" w:hAnsi="Consolas"/>
           <w:sz w:val="19"/>
         </w:rPr>
-        <w:t>429d335</w:t>
+        <w:t>1159e98</w:t>
       </w:r>
       <w:r>
         <w:t xml:space="preserve">, statut </w:t>
@@ -6559,7 +6559,7 @@
         <w:t>réussi</w:t>
       </w:r>
       <w:r>
-        <w:t xml:space="preserve"> en 4,8 min (https://gitlab.com/essalhi-moussa-group/automatisation_des_tests_et_qualite_logicielle/-/pipelines/2924651734). Rapport Allure publié sur GitLab Pages : https://automatisation-des-tests-et-qualite-logicielle-5d7828.gitlab.io/.</w:t>
+        <w:t xml:space="preserve"> en 4,9 min (https://gitlab.com/essalhi-moussa-group/automatisation_des_tests_et_qualite_logicielle/-/pipelines/2924665070). Rapport Allure publié sur GitLab Pages : https://automatisation-des-tests-et-qualite-logicielle-5d7828.gitlab.io/.</w:t>
       </w:r>
     </w:p>
     <w:p>
@@ -7012,7 +7012,7 @@
       <w:r>
         <w:drawing>
           <wp:inline xmlns:a="http://schemas.openxmlformats.org/drawingml/2006/main" xmlns:pic="http://schemas.openxmlformats.org/drawingml/2006/picture">
-            <wp:extent cx="5580000" cy="1639372"/>
+            <wp:extent cx="5580000" cy="1174736"/>
             <wp:docPr id="7" name="Picture 7"/>
             <wp:cNvGraphicFramePr>
               <a:graphicFrameLocks noChangeAspect="1"/>
@@ -7033,7 +7033,7 @@
                   <pic:spPr>
                     <a:xfrm>
                       <a:off x="0" y="0"/>
-                      <a:ext cx="5580000" cy="1639372"/>
+                      <a:ext cx="5580000" cy="1174736"/>
                     </a:xfrm>
                     <a:prstGeom prst="rect"/>
                   </pic:spPr>
@@ -7054,7 +7054,7 @@
           <w:color w:val="555B66"/>
           <w:sz w:val="17"/>
         </w:rPr>
-        <w:t>Figure 7 - Pipeline réel : onglet Tests (rapport JUnit) ; rapport Allure publié (GitLab Pages ou Jenkins)</w:t>
+        <w:t>Figure 7 - Pipeline réel : onglet Tests (rapport JUnit) ; rapport Allure publié (GitLab Pages ou Jenkins) ; notification de fin de pipeline (e-mail ou Slack/Discord)</w:t>
       </w:r>
     </w:p>
     <w:p>

</xml_diff>